<commit_message>
JABG cambios locales, funciones pequeñas
</commit_message>
<xml_diff>
--- a/public/bases-word/AC/CUMPLIMIENTO_FINANCIERO/AC_01.docx
+++ b/public/bases-word/AC/CUMPLIMIENTO_FINANCIERO/AC_01.docx
@@ -1,6 +1,6 @@
 
 <file path=word/document.xml><?xml version="1.0" encoding="utf-8"?>
-<w:document xmlns:wpc="http://schemas.microsoft.com/office/word/2010/wordprocessingCanvas" xmlns:cx="http://schemas.microsoft.com/office/drawing/2014/chartex" xmlns:cx1="http://schemas.microsoft.com/office/drawing/2015/9/8/chartex" xmlns:cx2="http://schemas.microsoft.com/office/drawing/2015/10/21/chartex" xmlns:cx3="http://schemas.microsoft.com/office/drawing/2016/5/9/chartex" xmlns:cx4="http://schemas.microsoft.com/office/drawing/2016/5/10/chartex" xmlns:cx5="http://schemas.microsoft.com/office/drawing/2016/5/11/chartex" xmlns:cx6="http://schemas.microsoft.com/office/drawing/2016/5/12/chartex" xmlns:cx7="http://schemas.microsoft.com/office/drawing/2016/5/13/chartex" xmlns:cx8="http://schemas.microsoft.com/office/drawing/2016/5/14/chartex" xmlns:mc="http://schemas.openxmlformats.org/markup-compatibility/2006" xmlns:aink="http://schemas.microsoft.com/office/drawing/2016/ink" xmlns:am3d="http://schemas.microsoft.com/office/drawing/2017/model3d" xmlns:o="urn:schemas-microsoft-com:office:office" xmlns:r="http://schemas.openxmlformats.org/officeDocument/2006/relationships" xmlns:m="http://schemas.openxmlformats.org/officeDocument/2006/math" xmlns:v="urn:schemas-microsoft-com:vml" xmlns:wp14="http://schemas.microsoft.com/office/word/2010/wordprocessingDrawing" xmlns:wp="http://schemas.openxmlformats.org/drawingml/2006/wordprocessingDrawing" xmlns:w10="urn:schemas-microsoft-com:office:word" xmlns:w="http://schemas.openxmlformats.org/wordprocessingml/2006/main" xmlns:w14="http://schemas.microsoft.com/office/word/2010/wordml" xmlns:w15="http://schemas.microsoft.com/office/word/2012/wordml" xmlns:w16cid="http://schemas.microsoft.com/office/word/2016/wordml/cid" xmlns:w16se="http://schemas.microsoft.com/office/word/2015/wordml/symex" xmlns:wpg="http://schemas.microsoft.com/office/word/2010/wordprocessingGroup" xmlns:wpi="http://schemas.microsoft.com/office/word/2010/wordprocessingInk" xmlns:wne="http://schemas.microsoft.com/office/word/2006/wordml" xmlns:wps="http://schemas.microsoft.com/office/word/2010/wordprocessingShape" mc:Ignorable="w14 w15 w16se w16cid wp14">
+<w:document xmlns:wpc="http://schemas.microsoft.com/office/word/2010/wordprocessingCanvas" xmlns:cx="http://schemas.microsoft.com/office/drawing/2014/chartex" xmlns:cx1="http://schemas.microsoft.com/office/drawing/2015/9/8/chartex" xmlns:cx2="http://schemas.microsoft.com/office/drawing/2015/10/21/chartex" xmlns:cx3="http://schemas.microsoft.com/office/drawing/2016/5/9/chartex" xmlns:cx4="http://schemas.microsoft.com/office/drawing/2016/5/10/chartex" xmlns:cx5="http://schemas.microsoft.com/office/drawing/2016/5/11/chartex" xmlns:cx6="http://schemas.microsoft.com/office/drawing/2016/5/12/chartex" xmlns:cx7="http://schemas.microsoft.com/office/drawing/2016/5/13/chartex" xmlns:cx8="http://schemas.microsoft.com/office/drawing/2016/5/14/chartex" xmlns:mc="http://schemas.openxmlformats.org/markup-compatibility/2006" xmlns:aink="http://schemas.microsoft.com/office/drawing/2016/ink" xmlns:am3d="http://schemas.microsoft.com/office/drawing/2017/model3d" xmlns:o="urn:schemas-microsoft-com:office:office" xmlns:oel="http://schemas.microsoft.com/office/2019/extlst" xmlns:r="http://schemas.openxmlformats.org/officeDocument/2006/relationships" xmlns:m="http://schemas.openxmlformats.org/officeDocument/2006/math" xmlns:v="urn:schemas-microsoft-com:vml" xmlns:wp14="http://schemas.microsoft.com/office/word/2010/wordprocessingDrawing" xmlns:wp="http://schemas.openxmlformats.org/drawingml/2006/wordprocessingDrawing" xmlns:w10="urn:schemas-microsoft-com:office:word" xmlns:w="http://schemas.openxmlformats.org/wordprocessingml/2006/main" xmlns:w14="http://schemas.microsoft.com/office/word/2010/wordml" xmlns:w15="http://schemas.microsoft.com/office/word/2012/wordml" xmlns:w16cex="http://schemas.microsoft.com/office/word/2018/wordml/cex" xmlns:w16cid="http://schemas.microsoft.com/office/word/2016/wordml/cid" xmlns:w16="http://schemas.microsoft.com/office/word/2018/wordml" xmlns:w16du="http://schemas.microsoft.com/office/word/2023/wordml/word16du" xmlns:w16sdtdh="http://schemas.microsoft.com/office/word/2020/wordml/sdtdatahash" xmlns:w16sdtfl="http://schemas.microsoft.com/office/word/2024/wordml/sdtformatlock" xmlns:w16se="http://schemas.microsoft.com/office/word/2015/wordml/symex" xmlns:wpg="http://schemas.microsoft.com/office/word/2010/wordprocessingGroup" xmlns:wpi="http://schemas.microsoft.com/office/word/2010/wordprocessingInk" xmlns:wne="http://schemas.microsoft.com/office/word/2006/wordml" xmlns:wps="http://schemas.microsoft.com/office/word/2010/wordprocessingShape" mc:Ignorable="w14 w15 w16se w16cid w16 w16cex w16sdtdh w16sdtfl w16du wp14">
   <w:body>
     <w:p>
       <w:pPr>
@@ -18,8 +18,6 @@
         </w:rPr>
       </w:pPr>
       <w:bookmarkStart w:id="0" w:name="_Hlk101883846"/>
-      <w:bookmarkStart w:id="1" w:name="_GoBack"/>
-      <w:bookmarkEnd w:id="1"/>
       <w:r>
         <w:rPr>
           <w:rFonts w:ascii="Regesto Grotesk" w:eastAsia="Arial" w:hAnsi="Regesto Grotesk" w:cs="Arial"/>
@@ -236,7 +234,7 @@
         </w:rPr>
         <w:t xml:space="preserve"> </w:t>
       </w:r>
-      <w:bookmarkStart w:id="2" w:name="_Hlk191979870"/>
+      <w:bookmarkStart w:id="1" w:name="_Hlk191979870"/>
       <w:r>
         <w:rPr>
           <w:rFonts w:ascii="Regesto Grotesk" w:hAnsi="Regesto Grotesk" w:cs="Arial"/>
@@ -246,7 +244,7 @@
         </w:rPr>
         <w:t xml:space="preserve">en fecha </w:t>
       </w:r>
-      <w:bookmarkStart w:id="3" w:name="_Hlk191977037"/>
+      <w:bookmarkStart w:id="2" w:name="_Hlk191977037"/>
       <w:r>
         <w:rPr>
           <w:rFonts w:ascii="Regesto Grotesk" w:hAnsi="Regesto Grotesk" w:cs="Arial"/>
@@ -276,17 +274,17 @@
         </w:rPr>
         <w:t xml:space="preserve">} </w:t>
       </w:r>
-      <w:bookmarkStart w:id="4" w:name="_Hlk156546690"/>
+      <w:bookmarkStart w:id="3" w:name="_Hlk156546690"/>
+      <w:bookmarkEnd w:id="2"/>
+      <w:r>
+        <w:rPr>
+          <w:rFonts w:ascii="Regesto Grotesk" w:hAnsi="Regesto Grotesk" w:cs="Arial"/>
+          <w:sz w:val="20"/>
+          <w:szCs w:val="20"/>
+        </w:rPr>
+        <w:t xml:space="preserve">le fue notificado a la entidad fiscalizada, </w:t>
+      </w:r>
       <w:bookmarkEnd w:id="3"/>
-      <w:r>
-        <w:rPr>
-          <w:rFonts w:ascii="Regesto Grotesk" w:hAnsi="Regesto Grotesk" w:cs="Arial"/>
-          <w:sz w:val="20"/>
-          <w:szCs w:val="20"/>
-        </w:rPr>
-        <w:t xml:space="preserve">le fue notificado a la entidad fiscalizada, </w:t>
-      </w:r>
-      <w:bookmarkEnd w:id="4"/>
       <w:r>
         <w:rPr>
           <w:rFonts w:ascii="Regesto Grotesk" w:hAnsi="Regesto Grotesk" w:cs="Arial"/>
@@ -304,8 +302,8 @@
         </w:rPr>
         <w:t xml:space="preserve">oficio número </w:t>
       </w:r>
-      <w:bookmarkStart w:id="5" w:name="_Hlk191978812"/>
-      <w:bookmarkStart w:id="6" w:name="_Hlk191977053"/>
+      <w:bookmarkStart w:id="4" w:name="_Hlk191978812"/>
+      <w:bookmarkStart w:id="5" w:name="_Hlk191977053"/>
       <w:r>
         <w:rPr>
           <w:rFonts w:ascii="Regesto Grotesk" w:hAnsi="Regesto Grotesk" w:cs="Arial"/>
@@ -338,6 +336,16 @@
         </w:rPr>
         <w:t>}</w:t>
       </w:r>
+      <w:bookmarkEnd w:id="4"/>
+      <w:r>
+        <w:rPr>
+          <w:rFonts w:ascii="Regesto Grotesk" w:hAnsi="Regesto Grotesk" w:cs="Arial"/>
+          <w:sz w:val="20"/>
+          <w:szCs w:val="20"/>
+        </w:rPr>
+        <w:t xml:space="preserve">, </w:t>
+      </w:r>
+      <w:bookmarkStart w:id="6" w:name="_Hlk191978846"/>
       <w:bookmarkEnd w:id="5"/>
       <w:r>
         <w:rPr>
@@ -345,96 +353,86 @@
           <w:sz w:val="20"/>
           <w:szCs w:val="20"/>
         </w:rPr>
-        <w:t xml:space="preserve">, </w:t>
-      </w:r>
-      <w:bookmarkStart w:id="7" w:name="_Hlk191978846"/>
+        <w:t xml:space="preserve">por medio del cual, </w:t>
+      </w:r>
+      <w:bookmarkStart w:id="7" w:name="_Hlk191977070"/>
+      <w:r>
+        <w:rPr>
+          <w:rFonts w:ascii="Regesto Grotesk" w:hAnsi="Regesto Grotesk" w:cs="Arial"/>
+          <w:sz w:val="20"/>
+          <w:szCs w:val="20"/>
+        </w:rPr>
+        <w:t xml:space="preserve">se le hizo del conocimiento la emisión del Acuerdo de Radicación respectivo y se le citó </w:t>
+      </w:r>
+      <w:r>
+        <w:rPr>
+          <w:rFonts w:ascii="Regesto Grotesk" w:eastAsia="Arial" w:hAnsi="Regesto Grotesk" w:cs="Arial"/>
+          <w:sz w:val="20"/>
+          <w:szCs w:val="20"/>
+        </w:rPr>
+        <w:t xml:space="preserve">a comparecencia para el efecto de que en ella se </w:t>
+      </w:r>
+      <w:r>
+        <w:rPr>
+          <w:rFonts w:ascii="Regesto Grotesk" w:eastAsia="Arial" w:hAnsi="Regesto Grotesk" w:cs="Arial"/>
+          <w:sz w:val="20"/>
+          <w:szCs w:val="20"/>
+          <w:highlight w:val="yellow"/>
+        </w:rPr>
+        <w:t xml:space="preserve">puntualizaran las </w:t>
+      </w:r>
+      <w:r>
+        <w:rPr>
+          <w:rFonts w:ascii="Regesto Grotesk" w:hAnsi="Regesto Grotesk" w:cs="Arial"/>
+          <w:sz w:val="20"/>
+          <w:szCs w:val="20"/>
+          <w:highlight w:val="yellow"/>
+        </w:rPr>
+        <w:t>observaciones</w:t>
+      </w:r>
+      <w:r>
+        <w:rPr>
+          <w:rFonts w:ascii="Regesto Grotesk" w:hAnsi="Regesto Grotesk" w:cs="Arial"/>
+          <w:sz w:val="20"/>
+          <w:szCs w:val="20"/>
+        </w:rPr>
+        <w:t xml:space="preserve"> d</w:t>
+      </w:r>
+      <w:r>
+        <w:rPr>
+          <w:rFonts w:ascii="Regesto Grotesk" w:eastAsia="Arial" w:hAnsi="Regesto Grotesk" w:cs="Arial"/>
+          <w:sz w:val="20"/>
+          <w:szCs w:val="20"/>
+        </w:rPr>
+        <w:t xml:space="preserve">e mérito </w:t>
+      </w:r>
       <w:bookmarkEnd w:id="6"/>
+      <w:bookmarkEnd w:id="7"/>
+      <w:r>
+        <w:rPr>
+          <w:rFonts w:ascii="Regesto Grotesk" w:eastAsia="Arial" w:hAnsi="Regesto Grotesk" w:cs="Arial"/>
+          <w:sz w:val="20"/>
+          <w:szCs w:val="20"/>
+        </w:rPr>
+        <w:t xml:space="preserve">y se pusiera a la vista el Expediente Técnico para su consulta e informarle de la apertura de la Etapa de Aclaración </w:t>
+      </w:r>
+      <w:bookmarkStart w:id="8" w:name="_Hlk191977091"/>
+      <w:bookmarkStart w:id="9" w:name="_Hlk191978863"/>
       <w:r>
         <w:rPr>
           <w:rFonts w:ascii="Regesto Grotesk" w:hAnsi="Regesto Grotesk" w:cs="Arial"/>
           <w:sz w:val="20"/>
           <w:szCs w:val="20"/>
         </w:rPr>
-        <w:t xml:space="preserve">por medio del cual, </w:t>
-      </w:r>
-      <w:bookmarkStart w:id="8" w:name="_Hlk191977070"/>
+        <w:t>${siRecomendaciones01}</w:t>
+      </w:r>
+      <w:bookmarkEnd w:id="8"/>
       <w:r>
         <w:rPr>
           <w:rFonts w:ascii="Regesto Grotesk" w:hAnsi="Regesto Grotesk" w:cs="Arial"/>
           <w:sz w:val="20"/>
           <w:szCs w:val="20"/>
         </w:rPr>
-        <w:t xml:space="preserve">se le hizo del conocimiento la emisión del Acuerdo de Radicación respectivo y se le citó </w:t>
-      </w:r>
-      <w:r>
-        <w:rPr>
-          <w:rFonts w:ascii="Regesto Grotesk" w:eastAsia="Arial" w:hAnsi="Regesto Grotesk" w:cs="Arial"/>
-          <w:sz w:val="20"/>
-          <w:szCs w:val="20"/>
-        </w:rPr>
-        <w:t xml:space="preserve">a comparecencia para el efecto de que en ella se </w:t>
-      </w:r>
-      <w:r>
-        <w:rPr>
-          <w:rFonts w:ascii="Regesto Grotesk" w:eastAsia="Arial" w:hAnsi="Regesto Grotesk" w:cs="Arial"/>
-          <w:sz w:val="20"/>
-          <w:szCs w:val="20"/>
-          <w:highlight w:val="yellow"/>
-        </w:rPr>
-        <w:t xml:space="preserve">puntualizaran las </w:t>
-      </w:r>
-      <w:r>
-        <w:rPr>
-          <w:rFonts w:ascii="Regesto Grotesk" w:hAnsi="Regesto Grotesk" w:cs="Arial"/>
-          <w:sz w:val="20"/>
-          <w:szCs w:val="20"/>
-          <w:highlight w:val="yellow"/>
-        </w:rPr>
-        <w:t>observaciones</w:t>
-      </w:r>
-      <w:r>
-        <w:rPr>
-          <w:rFonts w:ascii="Regesto Grotesk" w:hAnsi="Regesto Grotesk" w:cs="Arial"/>
-          <w:sz w:val="20"/>
-          <w:szCs w:val="20"/>
-        </w:rPr>
-        <w:t xml:space="preserve"> d</w:t>
-      </w:r>
-      <w:r>
-        <w:rPr>
-          <w:rFonts w:ascii="Regesto Grotesk" w:eastAsia="Arial" w:hAnsi="Regesto Grotesk" w:cs="Arial"/>
-          <w:sz w:val="20"/>
-          <w:szCs w:val="20"/>
-        </w:rPr>
-        <w:t xml:space="preserve">e mérito </w:t>
-      </w:r>
-      <w:bookmarkEnd w:id="7"/>
-      <w:bookmarkEnd w:id="8"/>
-      <w:r>
-        <w:rPr>
-          <w:rFonts w:ascii="Regesto Grotesk" w:eastAsia="Arial" w:hAnsi="Regesto Grotesk" w:cs="Arial"/>
-          <w:sz w:val="20"/>
-          <w:szCs w:val="20"/>
-        </w:rPr>
-        <w:t xml:space="preserve">y se pusiera a la vista el Expediente Técnico para su consulta e informarle de la apertura de la Etapa de Aclaración </w:t>
-      </w:r>
-      <w:bookmarkStart w:id="9" w:name="_Hlk191977091"/>
-      <w:bookmarkStart w:id="10" w:name="_Hlk191978863"/>
-      <w:r>
-        <w:rPr>
-          <w:rFonts w:ascii="Regesto Grotesk" w:hAnsi="Regesto Grotesk" w:cs="Arial"/>
-          <w:sz w:val="20"/>
-          <w:szCs w:val="20"/>
-        </w:rPr>
-        <w:t>${siRecomendaciones01}</w:t>
-      </w:r>
-      <w:bookmarkEnd w:id="9"/>
-      <w:r>
-        <w:rPr>
-          <w:rFonts w:ascii="Regesto Grotesk" w:hAnsi="Regesto Grotesk" w:cs="Arial"/>
-          <w:sz w:val="20"/>
-          <w:szCs w:val="20"/>
-        </w:rPr>
         <w:t>,</w:t>
       </w:r>
       <w:r>
@@ -445,7 +443,7 @@
         </w:rPr>
         <w:t xml:space="preserve"> con el objeto de que en un plazo de 30 (Treinta) días hábiles, solventara, aclarara o manifestara lo que a su derecho conviniera en relación al contenido de </w:t>
       </w:r>
-      <w:bookmarkStart w:id="11" w:name="_Hlk191977105"/>
+      <w:bookmarkStart w:id="10" w:name="_Hlk191977105"/>
       <w:r>
         <w:rPr>
           <w:rFonts w:ascii="Regesto Grotesk" w:eastAsia="Arial" w:hAnsi="Regesto Grotesk" w:cs="Arial"/>
@@ -484,9 +482,9 @@
         <w:t>; ${siRecomendaciones02}.</w:t>
       </w:r>
     </w:p>
-    <w:bookmarkEnd w:id="2"/>
+    <w:bookmarkEnd w:id="1"/>
+    <w:bookmarkEnd w:id="9"/>
     <w:bookmarkEnd w:id="10"/>
-    <w:bookmarkEnd w:id="11"/>
     <w:p>
       <w:pPr>
         <w:tabs>
@@ -519,7 +517,6 @@
           <w:tag w:val="goog_rdk_8"/>
           <w:id w:val="-617295181"/>
         </w:sdtPr>
-        <w:sdtEndPr/>
         <w:sdtContent/>
       </w:sdt>
       <w:r>
@@ -903,7 +900,7 @@
           <w:szCs w:val="20"/>
         </w:rPr>
       </w:pPr>
-      <w:bookmarkStart w:id="12" w:name="_Hlk101885415"/>
+      <w:bookmarkStart w:id="11" w:name="_Hlk101885415"/>
       <w:r>
         <w:rPr>
           <w:rFonts w:ascii="Regesto Grotesk" w:eastAsia="Arial" w:hAnsi="Regesto Grotesk" w:cs="Arial"/>
@@ -997,7 +994,7 @@
         <w:t>.</w:t>
       </w:r>
     </w:p>
-    <w:bookmarkEnd w:id="12"/>
+    <w:bookmarkEnd w:id="11"/>
     <w:p>
       <w:pPr>
         <w:tabs>
@@ -1083,7 +1080,7 @@
         </w:rPr>
         <w:t xml:space="preserve">Elaboró: </w:t>
       </w:r>
-      <w:bookmarkStart w:id="13" w:name="_Hlk195084992"/>
+      <w:bookmarkStart w:id="12" w:name="_Hlk195084992"/>
       <w:r>
         <w:rPr>
           <w:rFonts w:ascii="Regesto Grotesk" w:hAnsi="Regesto Grotesk"/>
@@ -1110,7 +1107,7 @@
         </w:rPr>
         <w:t>}</w:t>
       </w:r>
-      <w:bookmarkEnd w:id="13"/>
+      <w:bookmarkEnd w:id="12"/>
       <w:r>
         <w:rPr>
           <w:rFonts w:ascii="Regesto Grotesk" w:hAnsi="Regesto Grotesk"/>
@@ -1128,7 +1125,7 @@
         <w:tab/>
         <w:t xml:space="preserve">Revisó: </w:t>
       </w:r>
-      <w:bookmarkStart w:id="14" w:name="_Hlk195084997"/>
+      <w:bookmarkStart w:id="13" w:name="_Hlk195084997"/>
       <w:r>
         <w:rPr>
           <w:rFonts w:ascii="Regesto Grotesk" w:hAnsi="Regesto Grotesk"/>
@@ -1223,7 +1220,7 @@
         </w:rPr>
         <w:t>}</w:t>
       </w:r>
-      <w:bookmarkEnd w:id="14"/>
+      <w:bookmarkEnd w:id="13"/>
       <w:r>
         <w:rPr>
           <w:rFonts w:ascii="Regesto Grotesk" w:hAnsi="Regesto Grotesk"/>
@@ -1249,7 +1246,7 @@
         <w:tab/>
         <w:t xml:space="preserve">Validó: </w:t>
       </w:r>
-      <w:bookmarkStart w:id="15" w:name="_Hlk195085002"/>
+      <w:bookmarkStart w:id="14" w:name="_Hlk195085002"/>
       <w:r>
         <w:rPr>
           <w:rFonts w:ascii="Regesto Grotesk" w:hAnsi="Regesto Grotesk"/>
@@ -1276,7 +1273,7 @@
         </w:rPr>
         <w:t>}</w:t>
       </w:r>
-      <w:bookmarkEnd w:id="15"/>
+      <w:bookmarkEnd w:id="14"/>
     </w:p>
     <w:sectPr>
       <w:headerReference w:type="default" r:id="rId8"/>
@@ -1291,7 +1288,7 @@
 </file>
 
 <file path=word/endnotes.xml><?xml version="1.0" encoding="utf-8"?>
-<w:endnotes xmlns:wpc="http://schemas.microsoft.com/office/word/2010/wordprocessingCanvas" xmlns:cx="http://schemas.microsoft.com/office/drawing/2014/chartex" xmlns:cx1="http://schemas.microsoft.com/office/drawing/2015/9/8/chartex" xmlns:cx2="http://schemas.microsoft.com/office/drawing/2015/10/21/chartex" xmlns:cx3="http://schemas.microsoft.com/office/drawing/2016/5/9/chartex" xmlns:cx4="http://schemas.microsoft.com/office/drawing/2016/5/10/chartex" xmlns:cx5="http://schemas.microsoft.com/office/drawing/2016/5/11/chartex" xmlns:cx6="http://schemas.microsoft.com/office/drawing/2016/5/12/chartex" xmlns:cx7="http://schemas.microsoft.com/office/drawing/2016/5/13/chartex" xmlns:cx8="http://schemas.microsoft.com/office/drawing/2016/5/14/chartex" xmlns:mc="http://schemas.openxmlformats.org/markup-compatibility/2006" xmlns:aink="http://schemas.microsoft.com/office/drawing/2016/ink" xmlns:am3d="http://schemas.microsoft.com/office/drawing/2017/model3d" xmlns:o="urn:schemas-microsoft-com:office:office" xmlns:r="http://schemas.openxmlformats.org/officeDocument/2006/relationships" xmlns:m="http://schemas.openxmlformats.org/officeDocument/2006/math" xmlns:v="urn:schemas-microsoft-com:vml" xmlns:wp14="http://schemas.microsoft.com/office/word/2010/wordprocessingDrawing" xmlns:wp="http://schemas.openxmlformats.org/drawingml/2006/wordprocessingDrawing" xmlns:w10="urn:schemas-microsoft-com:office:word" xmlns:w="http://schemas.openxmlformats.org/wordprocessingml/2006/main" xmlns:w14="http://schemas.microsoft.com/office/word/2010/wordml" xmlns:w15="http://schemas.microsoft.com/office/word/2012/wordml" xmlns:w16cid="http://schemas.microsoft.com/office/word/2016/wordml/cid" xmlns:w16se="http://schemas.microsoft.com/office/word/2015/wordml/symex" xmlns:wpg="http://schemas.microsoft.com/office/word/2010/wordprocessingGroup" xmlns:wpi="http://schemas.microsoft.com/office/word/2010/wordprocessingInk" xmlns:wne="http://schemas.microsoft.com/office/word/2006/wordml" xmlns:wps="http://schemas.microsoft.com/office/word/2010/wordprocessingShape" mc:Ignorable="w14 w15 w16se w16cid wp14">
+<w:endnotes xmlns:wpc="http://schemas.microsoft.com/office/word/2010/wordprocessingCanvas" xmlns:cx="http://schemas.microsoft.com/office/drawing/2014/chartex" xmlns:cx1="http://schemas.microsoft.com/office/drawing/2015/9/8/chartex" xmlns:cx2="http://schemas.microsoft.com/office/drawing/2015/10/21/chartex" xmlns:cx3="http://schemas.microsoft.com/office/drawing/2016/5/9/chartex" xmlns:cx4="http://schemas.microsoft.com/office/drawing/2016/5/10/chartex" xmlns:cx5="http://schemas.microsoft.com/office/drawing/2016/5/11/chartex" xmlns:cx6="http://schemas.microsoft.com/office/drawing/2016/5/12/chartex" xmlns:cx7="http://schemas.microsoft.com/office/drawing/2016/5/13/chartex" xmlns:cx8="http://schemas.microsoft.com/office/drawing/2016/5/14/chartex" xmlns:mc="http://schemas.openxmlformats.org/markup-compatibility/2006" xmlns:aink="http://schemas.microsoft.com/office/drawing/2016/ink" xmlns:am3d="http://schemas.microsoft.com/office/drawing/2017/model3d" xmlns:o="urn:schemas-microsoft-com:office:office" xmlns:oel="http://schemas.microsoft.com/office/2019/extlst" xmlns:r="http://schemas.openxmlformats.org/officeDocument/2006/relationships" xmlns:m="http://schemas.openxmlformats.org/officeDocument/2006/math" xmlns:v="urn:schemas-microsoft-com:vml" xmlns:wp14="http://schemas.microsoft.com/office/word/2010/wordprocessingDrawing" xmlns:wp="http://schemas.openxmlformats.org/drawingml/2006/wordprocessingDrawing" xmlns:w10="urn:schemas-microsoft-com:office:word" xmlns:w="http://schemas.openxmlformats.org/wordprocessingml/2006/main" xmlns:w14="http://schemas.microsoft.com/office/word/2010/wordml" xmlns:w15="http://schemas.microsoft.com/office/word/2012/wordml" xmlns:w16cex="http://schemas.microsoft.com/office/word/2018/wordml/cex" xmlns:w16cid="http://schemas.microsoft.com/office/word/2016/wordml/cid" xmlns:w16="http://schemas.microsoft.com/office/word/2018/wordml" xmlns:w16du="http://schemas.microsoft.com/office/word/2023/wordml/word16du" xmlns:w16sdtdh="http://schemas.microsoft.com/office/word/2020/wordml/sdtdatahash" xmlns:w16sdtfl="http://schemas.microsoft.com/office/word/2024/wordml/sdtformatlock" xmlns:w16se="http://schemas.microsoft.com/office/word/2015/wordml/symex" xmlns:wpg="http://schemas.microsoft.com/office/word/2010/wordprocessingGroup" xmlns:wpi="http://schemas.microsoft.com/office/word/2010/wordprocessingInk" xmlns:wne="http://schemas.microsoft.com/office/word/2006/wordml" xmlns:wps="http://schemas.microsoft.com/office/word/2010/wordprocessingShape" mc:Ignorable="w14 w15 w16se w16cid w16 w16cex w16sdtdh w16sdtfl w16du wp14">
   <w:endnote w:type="separator" w:id="-1">
     <w:p>
       <w:pPr>
@@ -1316,7 +1313,7 @@
 </file>
 
 <file path=word/footer1.xml><?xml version="1.0" encoding="utf-8"?>
-<w:ftr xmlns:wpc="http://schemas.microsoft.com/office/word/2010/wordprocessingCanvas" xmlns:cx="http://schemas.microsoft.com/office/drawing/2014/chartex" xmlns:cx1="http://schemas.microsoft.com/office/drawing/2015/9/8/chartex" xmlns:cx2="http://schemas.microsoft.com/office/drawing/2015/10/21/chartex" xmlns:cx3="http://schemas.microsoft.com/office/drawing/2016/5/9/chartex" xmlns:cx4="http://schemas.microsoft.com/office/drawing/2016/5/10/chartex" xmlns:cx5="http://schemas.microsoft.com/office/drawing/2016/5/11/chartex" xmlns:cx6="http://schemas.microsoft.com/office/drawing/2016/5/12/chartex" xmlns:cx7="http://schemas.microsoft.com/office/drawing/2016/5/13/chartex" xmlns:cx8="http://schemas.microsoft.com/office/drawing/2016/5/14/chartex" xmlns:mc="http://schemas.openxmlformats.org/markup-compatibility/2006" xmlns:aink="http://schemas.microsoft.com/office/drawing/2016/ink" xmlns:am3d="http://schemas.microsoft.com/office/drawing/2017/model3d" xmlns:o="urn:schemas-microsoft-com:office:office" xmlns:r="http://schemas.openxmlformats.org/officeDocument/2006/relationships" xmlns:m="http://schemas.openxmlformats.org/officeDocument/2006/math" xmlns:v="urn:schemas-microsoft-com:vml" xmlns:wp14="http://schemas.microsoft.com/office/word/2010/wordprocessingDrawing" xmlns:wp="http://schemas.openxmlformats.org/drawingml/2006/wordprocessingDrawing" xmlns:w10="urn:schemas-microsoft-com:office:word" xmlns:w="http://schemas.openxmlformats.org/wordprocessingml/2006/main" xmlns:w14="http://schemas.microsoft.com/office/word/2010/wordml" xmlns:w15="http://schemas.microsoft.com/office/word/2012/wordml" xmlns:w16cid="http://schemas.microsoft.com/office/word/2016/wordml/cid" xmlns:w16se="http://schemas.microsoft.com/office/word/2015/wordml/symex" xmlns:wpg="http://schemas.microsoft.com/office/word/2010/wordprocessingGroup" xmlns:wpi="http://schemas.microsoft.com/office/word/2010/wordprocessingInk" xmlns:wne="http://schemas.microsoft.com/office/word/2006/wordml" xmlns:wps="http://schemas.microsoft.com/office/word/2010/wordprocessingShape" mc:Ignorable="w14 w15 w16se w16cid wp14">
+<w:ftr xmlns:wpc="http://schemas.microsoft.com/office/word/2010/wordprocessingCanvas" xmlns:cx="http://schemas.microsoft.com/office/drawing/2014/chartex" xmlns:cx1="http://schemas.microsoft.com/office/drawing/2015/9/8/chartex" xmlns:cx2="http://schemas.microsoft.com/office/drawing/2015/10/21/chartex" xmlns:cx3="http://schemas.microsoft.com/office/drawing/2016/5/9/chartex" xmlns:cx4="http://schemas.microsoft.com/office/drawing/2016/5/10/chartex" xmlns:cx5="http://schemas.microsoft.com/office/drawing/2016/5/11/chartex" xmlns:cx6="http://schemas.microsoft.com/office/drawing/2016/5/12/chartex" xmlns:cx7="http://schemas.microsoft.com/office/drawing/2016/5/13/chartex" xmlns:cx8="http://schemas.microsoft.com/office/drawing/2016/5/14/chartex" xmlns:mc="http://schemas.openxmlformats.org/markup-compatibility/2006" xmlns:aink="http://schemas.microsoft.com/office/drawing/2016/ink" xmlns:am3d="http://schemas.microsoft.com/office/drawing/2017/model3d" xmlns:o="urn:schemas-microsoft-com:office:office" xmlns:oel="http://schemas.microsoft.com/office/2019/extlst" xmlns:r="http://schemas.openxmlformats.org/officeDocument/2006/relationships" xmlns:m="http://schemas.openxmlformats.org/officeDocument/2006/math" xmlns:v="urn:schemas-microsoft-com:vml" xmlns:wp14="http://schemas.microsoft.com/office/word/2010/wordprocessingDrawing" xmlns:wp="http://schemas.openxmlformats.org/drawingml/2006/wordprocessingDrawing" xmlns:w10="urn:schemas-microsoft-com:office:word" xmlns:w="http://schemas.openxmlformats.org/wordprocessingml/2006/main" xmlns:w14="http://schemas.microsoft.com/office/word/2010/wordml" xmlns:w15="http://schemas.microsoft.com/office/word/2012/wordml" xmlns:w16cex="http://schemas.microsoft.com/office/word/2018/wordml/cex" xmlns:w16cid="http://schemas.microsoft.com/office/word/2016/wordml/cid" xmlns:w16="http://schemas.microsoft.com/office/word/2018/wordml" xmlns:w16du="http://schemas.microsoft.com/office/word/2023/wordml/word16du" xmlns:w16sdtdh="http://schemas.microsoft.com/office/word/2020/wordml/sdtdatahash" xmlns:w16sdtfl="http://schemas.microsoft.com/office/word/2024/wordml/sdtformatlock" xmlns:w16se="http://schemas.microsoft.com/office/word/2015/wordml/symex" xmlns:wpg="http://schemas.microsoft.com/office/word/2010/wordprocessingGroup" xmlns:wpi="http://schemas.microsoft.com/office/word/2010/wordprocessingInk" xmlns:wne="http://schemas.microsoft.com/office/word/2006/wordml" xmlns:wps="http://schemas.microsoft.com/office/word/2010/wordprocessingShape" mc:Ignorable="w14 w15 w16se w16cid w16 w16cex w16sdtdh w16sdtfl w16du wp14">
   <w:tbl>
     <w:tblPr>
       <w:tblStyle w:val="Tablaconcuadrcula"/>
@@ -1724,7 +1721,6 @@
               <w:docPartUnique/>
             </w:docPartObj>
           </w:sdtPr>
-          <w:sdtEndPr/>
           <w:sdtContent>
             <w:p>
               <w:pPr>
@@ -1901,7 +1897,7 @@
 </file>
 
 <file path=word/footnotes.xml><?xml version="1.0" encoding="utf-8"?>
-<w:footnotes xmlns:wpc="http://schemas.microsoft.com/office/word/2010/wordprocessingCanvas" xmlns:cx="http://schemas.microsoft.com/office/drawing/2014/chartex" xmlns:cx1="http://schemas.microsoft.com/office/drawing/2015/9/8/chartex" xmlns:cx2="http://schemas.microsoft.com/office/drawing/2015/10/21/chartex" xmlns:cx3="http://schemas.microsoft.com/office/drawing/2016/5/9/chartex" xmlns:cx4="http://schemas.microsoft.com/office/drawing/2016/5/10/chartex" xmlns:cx5="http://schemas.microsoft.com/office/drawing/2016/5/11/chartex" xmlns:cx6="http://schemas.microsoft.com/office/drawing/2016/5/12/chartex" xmlns:cx7="http://schemas.microsoft.com/office/drawing/2016/5/13/chartex" xmlns:cx8="http://schemas.microsoft.com/office/drawing/2016/5/14/chartex" xmlns:mc="http://schemas.openxmlformats.org/markup-compatibility/2006" xmlns:aink="http://schemas.microsoft.com/office/drawing/2016/ink" xmlns:am3d="http://schemas.microsoft.com/office/drawing/2017/model3d" xmlns:o="urn:schemas-microsoft-com:office:office" xmlns:r="http://schemas.openxmlformats.org/officeDocument/2006/relationships" xmlns:m="http://schemas.openxmlformats.org/officeDocument/2006/math" xmlns:v="urn:schemas-microsoft-com:vml" xmlns:wp14="http://schemas.microsoft.com/office/word/2010/wordprocessingDrawing" xmlns:wp="http://schemas.openxmlformats.org/drawingml/2006/wordprocessingDrawing" xmlns:w10="urn:schemas-microsoft-com:office:word" xmlns:w="http://schemas.openxmlformats.org/wordprocessingml/2006/main" xmlns:w14="http://schemas.microsoft.com/office/word/2010/wordml" xmlns:w15="http://schemas.microsoft.com/office/word/2012/wordml" xmlns:w16cid="http://schemas.microsoft.com/office/word/2016/wordml/cid" xmlns:w16se="http://schemas.microsoft.com/office/word/2015/wordml/symex" xmlns:wpg="http://schemas.microsoft.com/office/word/2010/wordprocessingGroup" xmlns:wpi="http://schemas.microsoft.com/office/word/2010/wordprocessingInk" xmlns:wne="http://schemas.microsoft.com/office/word/2006/wordml" xmlns:wps="http://schemas.microsoft.com/office/word/2010/wordprocessingShape" mc:Ignorable="w14 w15 w16se w16cid wp14">
+<w:footnotes xmlns:wpc="http://schemas.microsoft.com/office/word/2010/wordprocessingCanvas" xmlns:cx="http://schemas.microsoft.com/office/drawing/2014/chartex" xmlns:cx1="http://schemas.microsoft.com/office/drawing/2015/9/8/chartex" xmlns:cx2="http://schemas.microsoft.com/office/drawing/2015/10/21/chartex" xmlns:cx3="http://schemas.microsoft.com/office/drawing/2016/5/9/chartex" xmlns:cx4="http://schemas.microsoft.com/office/drawing/2016/5/10/chartex" xmlns:cx5="http://schemas.microsoft.com/office/drawing/2016/5/11/chartex" xmlns:cx6="http://schemas.microsoft.com/office/drawing/2016/5/12/chartex" xmlns:cx7="http://schemas.microsoft.com/office/drawing/2016/5/13/chartex" xmlns:cx8="http://schemas.microsoft.com/office/drawing/2016/5/14/chartex" xmlns:mc="http://schemas.openxmlformats.org/markup-compatibility/2006" xmlns:aink="http://schemas.microsoft.com/office/drawing/2016/ink" xmlns:am3d="http://schemas.microsoft.com/office/drawing/2017/model3d" xmlns:o="urn:schemas-microsoft-com:office:office" xmlns:oel="http://schemas.microsoft.com/office/2019/extlst" xmlns:r="http://schemas.openxmlformats.org/officeDocument/2006/relationships" xmlns:m="http://schemas.openxmlformats.org/officeDocument/2006/math" xmlns:v="urn:schemas-microsoft-com:vml" xmlns:wp14="http://schemas.microsoft.com/office/word/2010/wordprocessingDrawing" xmlns:wp="http://schemas.openxmlformats.org/drawingml/2006/wordprocessingDrawing" xmlns:w10="urn:schemas-microsoft-com:office:word" xmlns:w="http://schemas.openxmlformats.org/wordprocessingml/2006/main" xmlns:w14="http://schemas.microsoft.com/office/word/2010/wordml" xmlns:w15="http://schemas.microsoft.com/office/word/2012/wordml" xmlns:w16cex="http://schemas.microsoft.com/office/word/2018/wordml/cex" xmlns:w16cid="http://schemas.microsoft.com/office/word/2016/wordml/cid" xmlns:w16="http://schemas.microsoft.com/office/word/2018/wordml" xmlns:w16du="http://schemas.microsoft.com/office/word/2023/wordml/word16du" xmlns:w16sdtdh="http://schemas.microsoft.com/office/word/2020/wordml/sdtdatahash" xmlns:w16sdtfl="http://schemas.microsoft.com/office/word/2024/wordml/sdtformatlock" xmlns:w16se="http://schemas.microsoft.com/office/word/2015/wordml/symex" xmlns:wpg="http://schemas.microsoft.com/office/word/2010/wordprocessingGroup" xmlns:wpi="http://schemas.microsoft.com/office/word/2010/wordprocessingInk" xmlns:wne="http://schemas.microsoft.com/office/word/2006/wordml" xmlns:wps="http://schemas.microsoft.com/office/word/2010/wordprocessingShape" mc:Ignorable="w14 w15 w16se w16cid w16 w16cex w16sdtdh w16sdtfl w16du wp14">
   <w:footnote w:type="separator" w:id="-1">
     <w:p>
       <w:pPr>
@@ -1926,7 +1922,7 @@
 </file>
 
 <file path=word/header1.xml><?xml version="1.0" encoding="utf-8"?>
-<w:hdr xmlns:wpc="http://schemas.microsoft.com/office/word/2010/wordprocessingCanvas" xmlns:cx="http://schemas.microsoft.com/office/drawing/2014/chartex" xmlns:cx1="http://schemas.microsoft.com/office/drawing/2015/9/8/chartex" xmlns:cx2="http://schemas.microsoft.com/office/drawing/2015/10/21/chartex" xmlns:cx3="http://schemas.microsoft.com/office/drawing/2016/5/9/chartex" xmlns:cx4="http://schemas.microsoft.com/office/drawing/2016/5/10/chartex" xmlns:cx5="http://schemas.microsoft.com/office/drawing/2016/5/11/chartex" xmlns:cx6="http://schemas.microsoft.com/office/drawing/2016/5/12/chartex" xmlns:cx7="http://schemas.microsoft.com/office/drawing/2016/5/13/chartex" xmlns:cx8="http://schemas.microsoft.com/office/drawing/2016/5/14/chartex" xmlns:mc="http://schemas.openxmlformats.org/markup-compatibility/2006" xmlns:aink="http://schemas.microsoft.com/office/drawing/2016/ink" xmlns:am3d="http://schemas.microsoft.com/office/drawing/2017/model3d" xmlns:o="urn:schemas-microsoft-com:office:office" xmlns:r="http://schemas.openxmlformats.org/officeDocument/2006/relationships" xmlns:m="http://schemas.openxmlformats.org/officeDocument/2006/math" xmlns:v="urn:schemas-microsoft-com:vml" xmlns:wp14="http://schemas.microsoft.com/office/word/2010/wordprocessingDrawing" xmlns:wp="http://schemas.openxmlformats.org/drawingml/2006/wordprocessingDrawing" xmlns:w10="urn:schemas-microsoft-com:office:word" xmlns:w="http://schemas.openxmlformats.org/wordprocessingml/2006/main" xmlns:w14="http://schemas.microsoft.com/office/word/2010/wordml" xmlns:w15="http://schemas.microsoft.com/office/word/2012/wordml" xmlns:w16cid="http://schemas.microsoft.com/office/word/2016/wordml/cid" xmlns:w16se="http://schemas.microsoft.com/office/word/2015/wordml/symex" xmlns:wpg="http://schemas.microsoft.com/office/word/2010/wordprocessingGroup" xmlns:wpi="http://schemas.microsoft.com/office/word/2010/wordprocessingInk" xmlns:wne="http://schemas.microsoft.com/office/word/2006/wordml" xmlns:wps="http://schemas.microsoft.com/office/word/2010/wordprocessingShape" mc:Ignorable="w14 w15 w16se w16cid wp14">
+<w:hdr xmlns:wpc="http://schemas.microsoft.com/office/word/2010/wordprocessingCanvas" xmlns:cx="http://schemas.microsoft.com/office/drawing/2014/chartex" xmlns:cx1="http://schemas.microsoft.com/office/drawing/2015/9/8/chartex" xmlns:cx2="http://schemas.microsoft.com/office/drawing/2015/10/21/chartex" xmlns:cx3="http://schemas.microsoft.com/office/drawing/2016/5/9/chartex" xmlns:cx4="http://schemas.microsoft.com/office/drawing/2016/5/10/chartex" xmlns:cx5="http://schemas.microsoft.com/office/drawing/2016/5/11/chartex" xmlns:cx6="http://schemas.microsoft.com/office/drawing/2016/5/12/chartex" xmlns:cx7="http://schemas.microsoft.com/office/drawing/2016/5/13/chartex" xmlns:cx8="http://schemas.microsoft.com/office/drawing/2016/5/14/chartex" xmlns:mc="http://schemas.openxmlformats.org/markup-compatibility/2006" xmlns:aink="http://schemas.microsoft.com/office/drawing/2016/ink" xmlns:am3d="http://schemas.microsoft.com/office/drawing/2017/model3d" xmlns:o="urn:schemas-microsoft-com:office:office" xmlns:oel="http://schemas.microsoft.com/office/2019/extlst" xmlns:r="http://schemas.openxmlformats.org/officeDocument/2006/relationships" xmlns:m="http://schemas.openxmlformats.org/officeDocument/2006/math" xmlns:v="urn:schemas-microsoft-com:vml" xmlns:wp14="http://schemas.microsoft.com/office/word/2010/wordprocessingDrawing" xmlns:wp="http://schemas.openxmlformats.org/drawingml/2006/wordprocessingDrawing" xmlns:w10="urn:schemas-microsoft-com:office:word" xmlns:w="http://schemas.openxmlformats.org/wordprocessingml/2006/main" xmlns:w14="http://schemas.microsoft.com/office/word/2010/wordml" xmlns:w15="http://schemas.microsoft.com/office/word/2012/wordml" xmlns:w16cex="http://schemas.microsoft.com/office/word/2018/wordml/cex" xmlns:w16cid="http://schemas.microsoft.com/office/word/2016/wordml/cid" xmlns:w16="http://schemas.microsoft.com/office/word/2018/wordml" xmlns:w16du="http://schemas.microsoft.com/office/word/2023/wordml/word16du" xmlns:w16sdtdh="http://schemas.microsoft.com/office/word/2020/wordml/sdtdatahash" xmlns:w16sdtfl="http://schemas.microsoft.com/office/word/2024/wordml/sdtformatlock" xmlns:w16se="http://schemas.microsoft.com/office/word/2015/wordml/symex" xmlns:wpg="http://schemas.microsoft.com/office/word/2010/wordprocessingGroup" xmlns:wpi="http://schemas.microsoft.com/office/word/2010/wordprocessingInk" xmlns:wne="http://schemas.microsoft.com/office/word/2006/wordml" xmlns:wps="http://schemas.microsoft.com/office/word/2010/wordprocessingShape" mc:Ignorable="w14 w15 w16se w16cid w16 w16cex w16sdtdh w16sdtfl w16du wp14">
   <w:tbl>
     <w:tblPr>
       <w:tblStyle w:val="Tablaconcuadrcula"/>
@@ -1966,15 +1962,15 @@
               <w:szCs w:val="16"/>
             </w:rPr>
           </w:pPr>
-          <w:bookmarkStart w:id="16" w:name="_Hlk194568822"/>
-          <w:bookmarkStart w:id="17" w:name="_Hlk195085350"/>
-          <w:bookmarkStart w:id="18" w:name="_Hlk195085351"/>
-          <w:bookmarkStart w:id="19" w:name="_Hlk195085703"/>
-          <w:bookmarkStart w:id="20" w:name="_Hlk195085704"/>
-          <w:bookmarkStart w:id="21" w:name="_Hlk195085833"/>
-          <w:bookmarkStart w:id="22" w:name="_Hlk195085834"/>
-          <w:bookmarkStart w:id="23" w:name="_Hlk195086150"/>
-          <w:bookmarkStart w:id="24" w:name="_Hlk195086151"/>
+          <w:bookmarkStart w:id="15" w:name="_Hlk194568822"/>
+          <w:bookmarkStart w:id="16" w:name="_Hlk195085350"/>
+          <w:bookmarkStart w:id="17" w:name="_Hlk195085351"/>
+          <w:bookmarkStart w:id="18" w:name="_Hlk195085703"/>
+          <w:bookmarkStart w:id="19" w:name="_Hlk195085704"/>
+          <w:bookmarkStart w:id="20" w:name="_Hlk195085833"/>
+          <w:bookmarkStart w:id="21" w:name="_Hlk195085834"/>
+          <w:bookmarkStart w:id="22" w:name="_Hlk195086150"/>
+          <w:bookmarkStart w:id="23" w:name="_Hlk195086151"/>
           <w:r>
             <w:rPr>
               <w:rFonts w:ascii="Athelas" w:hAnsi="Athelas"/>
@@ -2055,7 +2051,17 @@
               <w:sz w:val="16"/>
               <w:szCs w:val="16"/>
             </w:rPr>
-            <w:t>“2025. Bicentenario de la vida municipal en el Estado de México</w:t>
+            <w:t>“</w:t>
+          </w:r>
+          <w:r>
+            <w:rPr>
+              <w:rFonts w:ascii="Athelas" w:hAnsi="Athelas"/>
+              <w:b/>
+              <w:spacing w:val="-4"/>
+              <w:sz w:val="16"/>
+              <w:szCs w:val="16"/>
+            </w:rPr>
+            <w:t>2026. Año del Humanismo Mexicano en el Estado de México</w:t>
           </w:r>
           <w:r>
             <w:rPr>
@@ -2100,7 +2106,7 @@
         </w:p>
       </w:tc>
     </w:tr>
-    <w:bookmarkEnd w:id="16"/>
+    <w:bookmarkEnd w:id="15"/>
   </w:tbl>
   <w:p>
     <w:pPr>
@@ -2157,6 +2163,7 @@
       <w:t>}</w:t>
     </w:r>
   </w:p>
+  <w:bookmarkEnd w:id="16"/>
   <w:bookmarkEnd w:id="17"/>
   <w:bookmarkEnd w:id="18"/>
   <w:bookmarkEnd w:id="19"/>
@@ -2164,7 +2171,6 @@
   <w:bookmarkEnd w:id="21"/>
   <w:bookmarkEnd w:id="22"/>
   <w:bookmarkEnd w:id="23"/>
-  <w:bookmarkEnd w:id="24"/>
   <w:p>
     <w:pPr>
       <w:pStyle w:val="Encabezado"/>
@@ -2174,7 +2180,7 @@
 </file>
 
 <file path=word/numbering.xml><?xml version="1.0" encoding="utf-8"?>
-<w:numbering xmlns:wpc="http://schemas.microsoft.com/office/word/2010/wordprocessingCanvas" xmlns:cx="http://schemas.microsoft.com/office/drawing/2014/chartex" xmlns:cx1="http://schemas.microsoft.com/office/drawing/2015/9/8/chartex" xmlns:cx2="http://schemas.microsoft.com/office/drawing/2015/10/21/chartex" xmlns:cx3="http://schemas.microsoft.com/office/drawing/2016/5/9/chartex" xmlns:cx4="http://schemas.microsoft.com/office/drawing/2016/5/10/chartex" xmlns:cx5="http://schemas.microsoft.com/office/drawing/2016/5/11/chartex" xmlns:cx6="http://schemas.microsoft.com/office/drawing/2016/5/12/chartex" xmlns:cx7="http://schemas.microsoft.com/office/drawing/2016/5/13/chartex" xmlns:cx8="http://schemas.microsoft.com/office/drawing/2016/5/14/chartex" xmlns:mc="http://schemas.openxmlformats.org/markup-compatibility/2006" xmlns:aink="http://schemas.microsoft.com/office/drawing/2016/ink" xmlns:am3d="http://schemas.microsoft.com/office/drawing/2017/model3d" xmlns:o="urn:schemas-microsoft-com:office:office" xmlns:r="http://schemas.openxmlformats.org/officeDocument/2006/relationships" xmlns:m="http://schemas.openxmlformats.org/officeDocument/2006/math" xmlns:v="urn:schemas-microsoft-com:vml" xmlns:wp14="http://schemas.microsoft.com/office/word/2010/wordprocessingDrawing" xmlns:wp="http://schemas.openxmlformats.org/drawingml/2006/wordprocessingDrawing" xmlns:w10="urn:schemas-microsoft-com:office:word" xmlns:w="http://schemas.openxmlformats.org/wordprocessingml/2006/main" xmlns:w14="http://schemas.microsoft.com/office/word/2010/wordml" xmlns:w15="http://schemas.microsoft.com/office/word/2012/wordml" xmlns:w16cid="http://schemas.microsoft.com/office/word/2016/wordml/cid" xmlns:w16se="http://schemas.microsoft.com/office/word/2015/wordml/symex" xmlns:wpg="http://schemas.microsoft.com/office/word/2010/wordprocessingGroup" xmlns:wpi="http://schemas.microsoft.com/office/word/2010/wordprocessingInk" xmlns:wne="http://schemas.microsoft.com/office/word/2006/wordml" xmlns:wps="http://schemas.microsoft.com/office/word/2010/wordprocessingShape" mc:Ignorable="w14 w15 w16se w16cid wp14">
+<w:numbering xmlns:wpc="http://schemas.microsoft.com/office/word/2010/wordprocessingCanvas" xmlns:cx="http://schemas.microsoft.com/office/drawing/2014/chartex" xmlns:cx1="http://schemas.microsoft.com/office/drawing/2015/9/8/chartex" xmlns:cx2="http://schemas.microsoft.com/office/drawing/2015/10/21/chartex" xmlns:cx3="http://schemas.microsoft.com/office/drawing/2016/5/9/chartex" xmlns:cx4="http://schemas.microsoft.com/office/drawing/2016/5/10/chartex" xmlns:cx5="http://schemas.microsoft.com/office/drawing/2016/5/11/chartex" xmlns:cx6="http://schemas.microsoft.com/office/drawing/2016/5/12/chartex" xmlns:cx7="http://schemas.microsoft.com/office/drawing/2016/5/13/chartex" xmlns:cx8="http://schemas.microsoft.com/office/drawing/2016/5/14/chartex" xmlns:mc="http://schemas.openxmlformats.org/markup-compatibility/2006" xmlns:aink="http://schemas.microsoft.com/office/drawing/2016/ink" xmlns:am3d="http://schemas.microsoft.com/office/drawing/2017/model3d" xmlns:o="urn:schemas-microsoft-com:office:office" xmlns:oel="http://schemas.microsoft.com/office/2019/extlst" xmlns:r="http://schemas.openxmlformats.org/officeDocument/2006/relationships" xmlns:m="http://schemas.openxmlformats.org/officeDocument/2006/math" xmlns:v="urn:schemas-microsoft-com:vml" xmlns:wp14="http://schemas.microsoft.com/office/word/2010/wordprocessingDrawing" xmlns:wp="http://schemas.openxmlformats.org/drawingml/2006/wordprocessingDrawing" xmlns:w10="urn:schemas-microsoft-com:office:word" xmlns:w="http://schemas.openxmlformats.org/wordprocessingml/2006/main" xmlns:w14="http://schemas.microsoft.com/office/word/2010/wordml" xmlns:w15="http://schemas.microsoft.com/office/word/2012/wordml" xmlns:w16cex="http://schemas.microsoft.com/office/word/2018/wordml/cex" xmlns:w16cid="http://schemas.microsoft.com/office/word/2016/wordml/cid" xmlns:w16="http://schemas.microsoft.com/office/word/2018/wordml" xmlns:w16du="http://schemas.microsoft.com/office/word/2023/wordml/word16du" xmlns:w16sdtdh="http://schemas.microsoft.com/office/word/2020/wordml/sdtdatahash" xmlns:w16sdtfl="http://schemas.microsoft.com/office/word/2024/wordml/sdtformatlock" xmlns:w16se="http://schemas.microsoft.com/office/word/2015/wordml/symex" xmlns:wpg="http://schemas.microsoft.com/office/word/2010/wordprocessingGroup" xmlns:wpi="http://schemas.microsoft.com/office/word/2010/wordprocessingInk" xmlns:wne="http://schemas.microsoft.com/office/word/2006/wordml" xmlns:wps="http://schemas.microsoft.com/office/word/2010/wordprocessingShape" mc:Ignorable="w14 w15 w16se w16cid w16 w16cex w16sdtdh w16sdtfl w16du wp14">
   <w:abstractNum w:abstractNumId="0" w15:restartNumberingAfterBreak="0">
     <w:nsid w:val="21CE0145"/>
     <w:multiLevelType w:val="hybridMultilevel"/>
@@ -2261,14 +2267,14 @@
       </w:pPr>
     </w:lvl>
   </w:abstractNum>
-  <w:num w:numId="1">
+  <w:num w:numId="1" w16cid:durableId="435901837">
     <w:abstractNumId w:val="0"/>
   </w:num>
 </w:numbering>
 </file>
 
 <file path=word/styles.xml><?xml version="1.0" encoding="utf-8"?>
-<w:styles xmlns:mc="http://schemas.openxmlformats.org/markup-compatibility/2006" xmlns:r="http://schemas.openxmlformats.org/officeDocument/2006/relationships" xmlns:w="http://schemas.openxmlformats.org/wordprocessingml/2006/main" xmlns:w14="http://schemas.microsoft.com/office/word/2010/wordml" xmlns:w15="http://schemas.microsoft.com/office/word/2012/wordml" xmlns:w16cid="http://schemas.microsoft.com/office/word/2016/wordml/cid" xmlns:w16se="http://schemas.microsoft.com/office/word/2015/wordml/symex" mc:Ignorable="w14 w15 w16se w16cid">
+<w:styles xmlns:mc="http://schemas.openxmlformats.org/markup-compatibility/2006" xmlns:r="http://schemas.openxmlformats.org/officeDocument/2006/relationships" xmlns:w="http://schemas.openxmlformats.org/wordprocessingml/2006/main" xmlns:w14="http://schemas.microsoft.com/office/word/2010/wordml" xmlns:w15="http://schemas.microsoft.com/office/word/2012/wordml" xmlns:w16cex="http://schemas.microsoft.com/office/word/2018/wordml/cex" xmlns:w16cid="http://schemas.microsoft.com/office/word/2016/wordml/cid" xmlns:w16="http://schemas.microsoft.com/office/word/2018/wordml" xmlns:w16du="http://schemas.microsoft.com/office/word/2023/wordml/word16du" xmlns:w16sdtdh="http://schemas.microsoft.com/office/word/2020/wordml/sdtdatahash" xmlns:w16sdtfl="http://schemas.microsoft.com/office/word/2024/wordml/sdtformatlock" xmlns:w16se="http://schemas.microsoft.com/office/word/2015/wordml/symex" mc:Ignorable="w14 w15 w16se w16cid w16 w16cex w16sdtdh w16sdtfl w16du">
   <w:docDefaults>
     <w:rPrDefault>
       <w:rPr>
@@ -2284,7 +2290,7 @@
       </w:pPr>
     </w:pPrDefault>
   </w:docDefaults>
-  <w:latentStyles w:defLockedState="0" w:defUIPriority="99" w:defSemiHidden="0" w:defUnhideWhenUsed="0" w:defQFormat="0" w:count="375">
+  <w:latentStyles w:defLockedState="0" w:defUIPriority="99" w:defSemiHidden="0" w:defUnhideWhenUsed="0" w:defQFormat="0" w:count="376">
     <w:lsdException w:name="Normal" w:uiPriority="0" w:qFormat="1"/>
     <w:lsdException w:name="heading 1" w:uiPriority="9" w:qFormat="1"/>
     <w:lsdException w:name="heading 2" w:semiHidden="1" w:uiPriority="9" w:unhideWhenUsed="1" w:qFormat="1"/>
@@ -2660,6 +2666,7 @@
     <w:lsdException w:name="Smart Hyperlink" w:semiHidden="1" w:unhideWhenUsed="1"/>
     <w:lsdException w:name="Hashtag" w:semiHidden="1" w:unhideWhenUsed="1"/>
     <w:lsdException w:name="Unresolved Mention" w:semiHidden="1" w:unhideWhenUsed="1"/>
+    <w:lsdException w:name="Smart Link" w:semiHidden="1" w:unhideWhenUsed="1"/>
   </w:latentStyles>
   <w:style w:type="paragraph" w:default="1" w:styleId="Normal">
     <w:name w:val="Normal"/>

</xml_diff>